<commit_message>
Remove build guide video link from flowchart docx (video currently private)
</commit_message>
<xml_diff>
--- a/Ionic-Film-Manufacturing-Process-Flowchart.docx
+++ b/Ionic-Film-Manufacturing-Process-Flowchart.docx
@@ -411,11 +411,6 @@
     </w:p>
     <w:p>
       <w:r>
-        <w:t xml:space="preserve">  Full build guide:       https://www.youtube.com/watch?v=c3tNXDlgE2M</w:t>
-      </w:r>
-    </w:p>
-    <w:p>
-      <w:r>
         <w:t xml:space="preserve">  Electrolysis cells:     https://www.youtube.com/watch?v=vx_uQVsYAuo</w:t>
       </w:r>
     </w:p>

</xml_diff>